<commit_message>
Agrega la tabla resena al modelo de StarUML y regenera DIAG-13, DIAG-27 y DIAG-28 a 150 dpi
</commit_message>
<xml_diff>
--- a/Fase 2/Evidencias Proyecto/Evidencias de documentación/DAS - Barberia Big Boys.docx
+++ b/Fase 2/Evidencias Proyecto/Evidencias de documentación/DAS - Barberia Big Boys.docx
@@ -6504,7 +6504,7 @@
       <w:r>
         <w:drawing>
           <wp:inline xmlns:a="http://schemas.openxmlformats.org/drawingml/2006/main" xmlns:pic="http://schemas.openxmlformats.org/drawingml/2006/picture">
-            <wp:extent cx="5580000" cy="4077297"/>
+            <wp:extent cx="5580000" cy="4079964"/>
             <wp:docPr id="22" name="Picture 22"/>
             <wp:cNvGraphicFramePr>
               <a:graphicFrameLocks noChangeAspect="1"/>
@@ -6525,7 +6525,7 @@
                   <pic:spPr>
                     <a:xfrm>
                       <a:off x="0" y="0"/>
-                      <a:ext cx="5580000" cy="4077297"/>
+                      <a:ext cx="5580000" cy="4079964"/>
                     </a:xfrm>
                     <a:prstGeom prst="rect"/>
                   </pic:spPr>
@@ -6745,7 +6745,7 @@
       <w:r>
         <w:drawing>
           <wp:inline xmlns:a="http://schemas.openxmlformats.org/drawingml/2006/main" xmlns:pic="http://schemas.openxmlformats.org/drawingml/2006/picture">
-            <wp:extent cx="5940000" cy="2206285"/>
+            <wp:extent cx="5940000" cy="2207422"/>
             <wp:docPr id="24" name="Picture 24"/>
             <wp:cNvGraphicFramePr>
               <a:graphicFrameLocks noChangeAspect="1"/>
@@ -6766,7 +6766,7 @@
                   <pic:spPr>
                     <a:xfrm>
                       <a:off x="0" y="0"/>
-                      <a:ext cx="5940000" cy="2206285"/>
+                      <a:ext cx="5940000" cy="2207422"/>
                     </a:xfrm>
                     <a:prstGeom prst="rect"/>
                   </pic:spPr>

</xml_diff>